<commit_message>
diffrence between ongoing task and the other tasks
</commit_message>
<xml_diff>
--- a/Guide rapide pour les utilisateurs.docx
+++ b/Guide rapide pour les utilisateurs.docx
@@ -65,6 +65,9 @@
     </w:p>
     <w:p>
       <w:r>
+        <w:rPr>
+          <w:noProof/>
+        </w:rPr>
         <w:drawing>
           <wp:inline distT="0" distB="0" distL="0" distR="0" wp14:anchorId="3E2262B7" wp14:editId="5588539F">
             <wp:extent cx="5760720" cy="2636520"/>
@@ -141,6 +144,9 @@
     </w:p>
     <w:p>
       <w:r>
+        <w:rPr>
+          <w:noProof/>
+        </w:rPr>
         <w:lastRenderedPageBreak/>
         <w:drawing>
           <wp:inline distT="0" distB="0" distL="0" distR="0" wp14:anchorId="24F683C3" wp14:editId="483648BE">
@@ -201,32 +207,20 @@
     </w:p>
     <w:p>
       <w:r>
-        <w:t>1. Sur la page des tâches, vous voyez plusieurs boutons (un par tâche).</w:t>
-      </w:r>
-    </w:p>
-    <w:p>
-      <w:r>
-        <w:t>2. Cliquez sur le bouton de la tâche que vous voulez mesurer : le chronomètre démarre immédiatement pour cette tâche.</w:t>
-      </w:r>
-    </w:p>
-    <w:p>
-      <w:r>
-        <w:t>3. Le bouton actif devient surligné : cela indique quelle tâche est en cours.</w:t>
-      </w:r>
-    </w:p>
-    <w:p>
-      <w:r>
+        <w:rPr>
+          <w:noProof/>
+        </w:rPr>
         <w:drawing>
-          <wp:anchor distT="0" distB="0" distL="114300" distR="114300" simplePos="0" relativeHeight="251658240" behindDoc="0" locked="0" layoutInCell="1" allowOverlap="1" wp14:anchorId="7BDBB643" wp14:editId="6799D412">
+          <wp:anchor distT="0" distB="0" distL="114300" distR="114300" simplePos="0" relativeHeight="251658240" behindDoc="0" locked="0" layoutInCell="1" allowOverlap="1" wp14:anchorId="7BDBB643" wp14:editId="3A0FBEA0">
             <wp:simplePos x="0" y="0"/>
-            <wp:positionH relativeFrom="column">
-              <wp:posOffset>1905</wp:posOffset>
+            <wp:positionH relativeFrom="margin">
+              <wp:align>left</wp:align>
             </wp:positionH>
             <wp:positionV relativeFrom="paragraph">
-              <wp:posOffset>-635</wp:posOffset>
+              <wp:posOffset>-61595</wp:posOffset>
             </wp:positionV>
-            <wp:extent cx="2368550" cy="2823340"/>
-            <wp:effectExtent l="0" t="0" r="0" b="0"/>
+            <wp:extent cx="3467100" cy="4132826"/>
+            <wp:effectExtent l="0" t="0" r="0" b="1270"/>
             <wp:wrapSquare wrapText="bothSides"/>
             <wp:docPr id="1603119135" name="Image 1"/>
             <wp:cNvGraphicFramePr>
@@ -255,7 +249,7 @@
                   <pic:spPr bwMode="auto">
                     <a:xfrm>
                       <a:off x="0" y="0"/>
-                      <a:ext cx="2368550" cy="2823340"/>
+                      <a:ext cx="3467100" cy="4132826"/>
                     </a:xfrm>
                     <a:prstGeom prst="rect">
                       <a:avLst/>
@@ -272,10 +266,33 @@
                 </pic:pic>
               </a:graphicData>
             </a:graphic>
+            <wp14:sizeRelH relativeFrom="margin">
+              <wp14:pctWidth>0</wp14:pctWidth>
+            </wp14:sizeRelH>
+            <wp14:sizeRelV relativeFrom="margin">
+              <wp14:pctHeight>0</wp14:pctHeight>
+            </wp14:sizeRelV>
           </wp:anchor>
         </w:drawing>
       </w:r>
-    </w:p>
+      <w:r>
+        <w:t>1. Sur la page des tâches, vous voyez plusieurs boutons (un par tâche).</w:t>
+      </w:r>
+    </w:p>
+    <w:p>
+      <w:r>
+        <w:t>2. Cliquez sur le bouton de la tâche que vous voulez mesurer : le chronomètre démarre immédiatement pour cette tâche.</w:t>
+      </w:r>
+    </w:p>
+    <w:p>
+      <w:r>
+        <w:t>3. La tâche en cours est encadrée en blanc</w:t>
+      </w:r>
+      <w:r>
+        <w:t>.</w:t>
+      </w:r>
+    </w:p>
+    <w:p/>
     <w:p>
       <w:r>
         <w:t>Remarque : un seul clic démarre la mesure, si vous cliquez plusieurs fois sur le même bouton, plusieurs mesures se feront.</w:t>
@@ -287,12 +304,27 @@
     <w:p/>
     <w:p/>
     <w:p>
-      <w:r>
+      <w:pPr>
         <w:rPr>
           <w:b/>
           <w:bCs/>
         </w:rPr>
-        <w:lastRenderedPageBreak/>
+      </w:pPr>
+    </w:p>
+    <w:p>
+      <w:pPr>
+        <w:rPr>
+          <w:b/>
+          <w:bCs/>
+        </w:rPr>
+      </w:pPr>
+    </w:p>
+    <w:p>
+      <w:r>
+        <w:rPr>
+          <w:b/>
+          <w:bCs/>
+        </w:rPr>
         <w:t>### Ajouter une nouvelle tâche pendant que le chronomètre tourne</w:t>
       </w:r>
     </w:p>
@@ -324,6 +356,9 @@
     </w:p>
     <w:p>
       <w:r>
+        <w:rPr>
+          <w:noProof/>
+        </w:rPr>
         <w:drawing>
           <wp:inline distT="0" distB="0" distL="0" distR="0" wp14:anchorId="6A7BB6EA" wp14:editId="272518F5">
             <wp:extent cx="4692891" cy="3892750"/>
@@ -368,6 +403,7 @@
     </w:p>
     <w:p>
       <w:r>
+        <w:lastRenderedPageBreak/>
         <w:t>- Le chronomètre reste associé à la tâche initiale (la nouvelle tâche ne démarre pas automatiquement).</w:t>
       </w:r>
     </w:p>
@@ -399,7 +435,6 @@
           <w:b/>
           <w:bCs/>
         </w:rPr>
-        <w:lastRenderedPageBreak/>
         <w:t>## 3) Pause / Reprendre</w:t>
       </w:r>
     </w:p>
@@ -492,6 +527,7 @@
     </w:p>
     <w:p>
       <w:r>
+        <w:lastRenderedPageBreak/>
         <w:t>Cliquez sur "Terminer la session".</w:t>
       </w:r>
     </w:p>
@@ -538,7 +574,6 @@
     </w:p>
     <w:p>
       <w:r>
-        <w:lastRenderedPageBreak/>
         <w:t>2. Pour chaque tâche, choisissez si elle est VA (valeur ajoutée) ou NVA (non-valeur ajoutée) en cliquant sur le bouton correspondant.</w:t>
       </w:r>
     </w:p>
@@ -549,6 +584,9 @@
     </w:p>
     <w:p>
       <w:r>
+        <w:rPr>
+          <w:noProof/>
+        </w:rPr>
         <w:drawing>
           <wp:inline distT="0" distB="0" distL="0" distR="0" wp14:anchorId="01C4C5BA" wp14:editId="20770A17">
             <wp:extent cx="3810196" cy="2311519"/>
@@ -619,6 +657,10 @@
     </w:p>
     <w:p>
       <w:r>
+        <w:rPr>
+          <w:noProof/>
+        </w:rPr>
+        <w:lastRenderedPageBreak/>
         <w:drawing>
           <wp:inline distT="0" distB="0" distL="0" distR="0" wp14:anchorId="065F5887" wp14:editId="6C3F7045">
             <wp:extent cx="2184400" cy="1361912"/>
@@ -1836,6 +1878,7 @@
   <w:style w:type="character" w:default="1" w:styleId="Policepardfaut">
     <w:name w:val="Default Paragraph Font"/>
     <w:uiPriority w:val="1"/>
+    <w:semiHidden/>
     <w:unhideWhenUsed/>
   </w:style>
   <w:style w:type="table" w:default="1" w:styleId="TableauNormal">

</xml_diff>